<commit_message>
docs: align architecture with google cloud hackathon
</commit_message>
<xml_diff>
--- a/PRD_AI_Native_Compliance_Automation_Refactored.docx
+++ b/PRD_AI_Native_Compliance_Automation_Refactored.docx
@@ -54,7 +54,7 @@
           <w:sz w:val="24"/>
           <w:sz-cs w:val="24"/>
         </w:rPr>
-        <w:t xml:space="preserve">**Primary hackathon stack:** OpenClaw, Antigravity CLI, Elastic, GitLab, Telegram Bot</w:t>
+        <w:t xml:space="preserve">**Primary hackathon stack:** Google Cloud Agent Builder / Gemini Enterprise Agent Platform, Cloud Run, Secret Manager, Antigravity CLI, Elastic, GitLab, Telegram Bot</w:t>
       </w:r>
     </w:p>
     <w:p>
@@ -109,7 +109,95 @@
           <w:sz w:val="24"/>
           <w:sz-cs w:val="24"/>
         </w:rPr>
-        <w:t xml:space="preserve">This product helps Flutter developers keep their Android and iOS native project configuration up to date with platform policy changes from Google, Apple, and Flutter. A developer submits one or more GitLab repository URLs. One isolated OpenClaw runtime hosts two agents: the Policy Context Agent keeps Elastic updated from official policy sources, and the PatchPilot Runtime MR Agent handles Telegram `/check`, queries Elastic, delegates repository edits to Antigravity CLI, commits the generated diff, and creates a GitLab Merge Request.</w:t>
+        <w:t xml:space="preserve">This product helps Flutter developers keep their Android and iOS native project</w:t>
+      </w:r>
+    </w:p>
+    <w:p>
+      <w:pPr/>
+      <w:r>
+        <w:rPr>
+          <w:rFonts w:ascii="Helvetica Light" w:hAnsi="Helvetica Light" w:cs="Helvetica Light"/>
+          <w:sz w:val="24"/>
+          <w:sz-cs w:val="24"/>
+        </w:rPr>
+        <w:t xml:space="preserve">configuration up to date with platform policy changes from Google, Apple, and</w:t>
+      </w:r>
+    </w:p>
+    <w:p>
+      <w:pPr/>
+      <w:r>
+        <w:rPr>
+          <w:rFonts w:ascii="Helvetica Light" w:hAnsi="Helvetica Light" w:cs="Helvetica Light"/>
+          <w:sz w:val="24"/>
+          <w:sz-cs w:val="24"/>
+        </w:rPr>
+        <w:t xml:space="preserve">Flutter. A developer submits one or more GitLab repository URLs. Google Cloud</w:t>
+      </w:r>
+    </w:p>
+    <w:p>
+      <w:pPr/>
+      <w:r>
+        <w:rPr>
+          <w:rFonts w:ascii="Helvetica Light" w:hAnsi="Helvetica Light" w:cs="Helvetica Light"/>
+          <w:sz w:val="24"/>
+          <w:sz-cs w:val="24"/>
+        </w:rPr>
+        <w:t xml:space="preserve">Agent Builder / Gemini Enterprise Agent Platform hosts the user-facing runtime</w:t>
+      </w:r>
+    </w:p>
+    <w:p>
+      <w:pPr/>
+      <w:r>
+        <w:rPr>
+          <w:rFonts w:ascii="Helvetica Light" w:hAnsi="Helvetica Light" w:cs="Helvetica Light"/>
+          <w:sz w:val="24"/>
+          <w:sz-cs w:val="24"/>
+        </w:rPr>
+        <w:t xml:space="preserve">agent, Cloud Run provides custom tool backends, Secret Manager stores secrets,</w:t>
+      </w:r>
+    </w:p>
+    <w:p>
+      <w:pPr/>
+      <w:r>
+        <w:rPr>
+          <w:rFonts w:ascii="Helvetica Light" w:hAnsi="Helvetica Light" w:cs="Helvetica Light"/>
+          <w:sz w:val="24"/>
+          <w:sz-cs w:val="24"/>
+        </w:rPr>
+        <w:t xml:space="preserve">the Policy Context Agent keeps Elastic updated from official policy sources, and</w:t>
+      </w:r>
+    </w:p>
+    <w:p>
+      <w:pPr/>
+      <w:r>
+        <w:rPr>
+          <w:rFonts w:ascii="Helvetica Light" w:hAnsi="Helvetica Light" w:cs="Helvetica Light"/>
+          <w:sz w:val="24"/>
+          <w:sz-cs w:val="24"/>
+        </w:rPr>
+        <w:t xml:space="preserve">the PatchPilot Runtime Agent handles Telegram `/check`, queries Elastic,</w:t>
+      </w:r>
+    </w:p>
+    <w:p>
+      <w:pPr/>
+      <w:r>
+        <w:rPr>
+          <w:rFonts w:ascii="Helvetica Light" w:hAnsi="Helvetica Light" w:cs="Helvetica Light"/>
+          <w:sz w:val="24"/>
+          <w:sz-cs w:val="24"/>
+        </w:rPr>
+        <w:t xml:space="preserve">delegates repository edits to Antigravity CLI, commits the generated diff, and</w:t>
+      </w:r>
+    </w:p>
+    <w:p>
+      <w:pPr/>
+      <w:r>
+        <w:rPr>
+          <w:rFonts w:ascii="Helvetica Light" w:hAnsi="Helvetica Light" w:cs="Helvetica Light"/>
+          <w:sz w:val="24"/>
+          <w:sz-cs w:val="24"/>
+        </w:rPr>
+        <w:t xml:space="preserve">creates a GitLab Merge Request.</w:t>
       </w:r>
     </w:p>
     <w:p>
@@ -263,7 +351,7 @@
           <w:sz w:val="24"/>
           <w:sz-cs w:val="24"/>
         </w:rPr>
-        <w:t xml:space="preserve">| Hackathon evaluator | See a clear two-agent OpenClaw flow using Elastic context, Antigravity, Telegram, and GitLab. |</w:t>
+        <w:t xml:space="preserve">| Hackathon evaluator | See a clear Google Cloud agent flow using Agent Builder, Cloud Run, Secret Manager, Elastic, Antigravity, Telegram, and GitLab. |</w:t>
       </w:r>
     </w:p>
     <w:p>
@@ -318,40 +406,51 @@
           <w:sz w:val="24"/>
           <w:sz-cs w:val="24"/>
         </w:rPr>
-        <w:t xml:space="preserve">2. Use a Policy Context Agent to maintain Elastic context for Google / Apple / Flutter policy docs.</w:t>
-      </w:r>
-    </w:p>
-    <w:p>
-      <w:pPr/>
-      <w:r>
-        <w:rPr>
-          <w:rFonts w:ascii="Helvetica Light" w:hAnsi="Helvetica Light" w:cs="Helvetica Light"/>
-          <w:sz w:val="24"/>
-          <w:sz-cs w:val="24"/>
-        </w:rPr>
-        <w:t xml:space="preserve">3. Use a Runtime MR Agent to query Elastic, invoke Antigravity CLI, and create GitLab MRs.</w:t>
-      </w:r>
-    </w:p>
-    <w:p>
-      <w:pPr/>
-      <w:r>
-        <w:rPr>
-          <w:rFonts w:ascii="Helvetica Light" w:hAnsi="Helvetica Light" w:cs="Helvetica Light"/>
-          <w:sz w:val="24"/>
-          <w:sz-cs w:val="24"/>
-        </w:rPr>
-        <w:t xml:space="preserve">4. Create GitLab Merge Requests with explanation, affected files, and human-review requirement.</w:t>
-      </w:r>
-    </w:p>
-    <w:p>
-      <w:pPr/>
-      <w:r>
-        <w:rPr>
-          <w:rFonts w:ascii="Helvetica Light" w:hAnsi="Helvetica Light" w:cs="Helvetica Light"/>
-          <w:sz w:val="24"/>
-          <w:sz-cs w:val="24"/>
-        </w:rPr>
-        <w:t xml:space="preserve">5. Keep private credentials out of public source code.</w:t>
+        <w:t xml:space="preserve">2. Use Google Cloud Agent Builder / Gemini Enterprise Agent Platform as the primary hackathon agent platform.</w:t>
+      </w:r>
+    </w:p>
+    <w:p>
+      <w:pPr/>
+      <w:r>
+        <w:rPr>
+          <w:rFonts w:ascii="Helvetica Light" w:hAnsi="Helvetica Light" w:cs="Helvetica Light"/>
+          <w:sz w:val="24"/>
+          <w:sz-cs w:val="24"/>
+        </w:rPr>
+        <w:t xml:space="preserve">3. Use a Policy Context Agent to maintain Elastic context for Google / Apple / Flutter policy docs.</w:t>
+      </w:r>
+    </w:p>
+    <w:p>
+      <w:pPr/>
+      <w:r>
+        <w:rPr>
+          <w:rFonts w:ascii="Helvetica Light" w:hAnsi="Helvetica Light" w:cs="Helvetica Light"/>
+          <w:sz w:val="24"/>
+          <w:sz-cs w:val="24"/>
+        </w:rPr>
+        <w:t xml:space="preserve">4. Use a Runtime MR Agent to query Elastic, invoke Antigravity CLI through Cloud Run, and create GitLab MRs.</w:t>
+      </w:r>
+    </w:p>
+    <w:p>
+      <w:pPr/>
+      <w:r>
+        <w:rPr>
+          <w:rFonts w:ascii="Helvetica Light" w:hAnsi="Helvetica Light" w:cs="Helvetica Light"/>
+          <w:sz w:val="24"/>
+          <w:sz-cs w:val="24"/>
+        </w:rPr>
+        <w:t xml:space="preserve">5. Create GitLab Merge Requests with explanation, affected files, and human-review requirement.</w:t>
+      </w:r>
+    </w:p>
+    <w:p>
+      <w:pPr/>
+      <w:r>
+        <w:rPr>
+          <w:rFonts w:ascii="Helvetica Light" w:hAnsi="Helvetica Light" w:cs="Helvetica Light"/>
+          <w:sz w:val="24"/>
+          <w:sz-cs w:val="24"/>
+        </w:rPr>
+        <w:t xml:space="preserve">6. Keep private credentials out of public source code.</w:t>
       </w:r>
     </w:p>
     <w:p>
@@ -516,18 +615,18 @@
           <w:sz w:val="24"/>
           <w:sz-cs w:val="24"/>
         </w:rPr>
-        <w:t xml:space="preserve">| Agent 1 | `patchpilot-runtime` | User-facing Telegram `/check`, Elastic read/query, GitLab clone/branch/commit/MR, Antigravity invocation, final Telegram result. |</w:t>
-      </w:r>
-    </w:p>
-    <w:p>
-      <w:pPr/>
-      <w:r>
-        <w:rPr>
-          <w:rFonts w:ascii="Helvetica Light" w:hAnsi="Helvetica Light" w:cs="Helvetica Light"/>
-          <w:sz w:val="24"/>
-          <w:sz-cs w:val="24"/>
-        </w:rPr>
-        <w:t xml:space="preserve">| Agent 2 | `policy-context` | Background/manual policy crawl, AI extraction/classification, generic coding guidance definition, Elastic write/upsert, crawl audit. |</w:t>
+        <w:t xml:space="preserve">| Agent 1 | `patchpilot-runtime` | User-facing Telegram `/check`, Elastic read/query, Cloud Run tool calls, GitLab clone/branch/commit/MR, Antigravity invocation, final Telegram result. |</w:t>
+      </w:r>
+    </w:p>
+    <w:p>
+      <w:pPr/>
+      <w:r>
+        <w:rPr>
+          <w:rFonts w:ascii="Helvetica Light" w:hAnsi="Helvetica Light" w:cs="Helvetica Light"/>
+          <w:sz w:val="24"/>
+          <w:sz-cs w:val="24"/>
+        </w:rPr>
+        <w:t xml:space="preserve">| Agent 2 | `policy-context` | Background/manual policy crawl, Gemini extraction/classification, generic coding guidance definition, Elastic write/upsert, crawl audit. |</w:t>
       </w:r>
     </w:p>
     <w:p>
@@ -626,7 +725,29 @@
           <w:sz w:val="24"/>
           <w:sz-cs w:val="24"/>
         </w:rPr>
-        <w:t xml:space="preserve">Used when the product becomes more than a hackathon demo. The Flutter Developer inputs repo list once, OpenClaw stores it in MongoDB by user account, and future checks can retrieve the user repository list.</w:t>
+        <w:t xml:space="preserve">Used when the product becomes more than a hackathon demo. The Flutter Developer</w:t>
+      </w:r>
+    </w:p>
+    <w:p>
+      <w:pPr/>
+      <w:r>
+        <w:rPr>
+          <w:rFonts w:ascii="Helvetica Light" w:hAnsi="Helvetica Light" w:cs="Helvetica Light"/>
+          <w:sz w:val="24"/>
+          <w:sz-cs w:val="24"/>
+        </w:rPr>
+        <w:t xml:space="preserve">inputs repo list once, the Google Cloud backend stores it in MongoDB by user</w:t>
+      </w:r>
+    </w:p>
+    <w:p>
+      <w:pPr/>
+      <w:r>
+        <w:rPr>
+          <w:rFonts w:ascii="Helvetica Light" w:hAnsi="Helvetica Light" w:cs="Helvetica Light"/>
+          <w:sz w:val="24"/>
+          <w:sz-cs w:val="24"/>
+        </w:rPr>
+        <w:t xml:space="preserve">account, and future checks can retrieve the user repository list.</w:t>
       </w:r>
     </w:p>
     <w:p>
@@ -758,7 +879,18 @@
           <w:sz w:val="24"/>
           <w:sz-cs w:val="24"/>
         </w:rPr>
-        <w:t xml:space="preserve">        participant OpenClaw as Agent 1: patchpilot-runtime</w:t>
+        <w:t xml:space="preserve">        participant AgentBuilder as Agent Builder: patchpilot-runtime</w:t>
+      </w:r>
+    </w:p>
+    <w:p>
+      <w:pPr/>
+      <w:r>
+        <w:rPr>
+          <w:rFonts w:ascii="Helvetica Light" w:hAnsi="Helvetica Light" w:cs="Helvetica Light"/>
+          <w:sz w:val="24"/>
+          <w:sz-cs w:val="24"/>
+        </w:rPr>
+        <w:t xml:space="preserve">        participant Backend as Cloud Run Tool Backend</w:t>
       </w:r>
     </w:p>
     <w:p>
@@ -912,7 +1044,7 @@
           <w:sz w:val="24"/>
           <w:sz-cs w:val="24"/>
         </w:rPr>
-        <w:t xml:space="preserve">        participant Secrets as Env Secrets</w:t>
+        <w:t xml:space="preserve">        participant Secrets as Secret Manager</w:t>
       </w:r>
     </w:p>
     <w:p>
@@ -956,73 +1088,84 @@
           <w:sz w:val="24"/>
           <w:sz-cs w:val="24"/>
         </w:rPr>
-        <w:t xml:space="preserve">    Dev-&gt;&gt;OpenClaw: Input GitLab repository list</w:t>
-      </w:r>
-    </w:p>
-    <w:p>
-      <w:pPr/>
-      <w:r>
-        <w:rPr>
-          <w:rFonts w:ascii="Helvetica Light" w:hAnsi="Helvetica Light" w:cs="Helvetica Light"/>
-          <w:sz w:val="24"/>
-          <w:sz-cs w:val="24"/>
-        </w:rPr>
-        <w:t xml:space="preserve">    OpenClaw-&gt;&gt;Secrets: Read MongoDB URI / GitLab token / Elastic key</w:t>
-      </w:r>
-    </w:p>
-    <w:p>
-      <w:pPr/>
-      <w:r>
-        <w:rPr>
-          <w:rFonts w:ascii="Helvetica Light" w:hAnsi="Helvetica Light" w:cs="Helvetica Light"/>
-          <w:sz w:val="24"/>
-          <w:sz-cs w:val="24"/>
-        </w:rPr>
-        <w:t xml:space="preserve">    OpenClaw-&gt;&gt;Mongo: Save repository list by user account</w:t>
-      </w:r>
-    </w:p>
-    <w:p>
-      <w:pPr/>
-      <w:r>
-        <w:rPr>
-          <w:rFonts w:ascii="Helvetica Light" w:hAnsi="Helvetica Light" w:cs="Helvetica Light"/>
-          <w:sz w:val="24"/>
-          <w:sz-cs w:val="24"/>
-        </w:rPr>
-        <w:t xml:space="preserve">    OpenClaw-&gt;&gt;Mongo: Get user's GitLab repository list</w:t>
-      </w:r>
-    </w:p>
-    <w:p>
-      <w:pPr/>
-      <w:r>
-        <w:rPr>
-          <w:rFonts w:ascii="Helvetica Light" w:hAnsi="Helvetica Light" w:cs="Helvetica Light"/>
-          <w:sz w:val="24"/>
-          <w:sz-cs w:val="24"/>
-        </w:rPr>
-        <w:t xml:space="preserve"/>
-      </w:r>
-    </w:p>
-    <w:p>
-      <w:pPr/>
-      <w:r>
-        <w:rPr>
-          <w:rFonts w:ascii="Helvetica Light" w:hAnsi="Helvetica Light" w:cs="Helvetica Light"/>
-          <w:sz w:val="24"/>
-          <w:sz-cs w:val="24"/>
-        </w:rPr>
-        <w:t xml:space="preserve">    OpenClaw-&gt;&gt;Elastic: Query already-indexed native app policy updates</w:t>
-      </w:r>
-    </w:p>
-    <w:p>
-      <w:pPr/>
-      <w:r>
-        <w:rPr>
-          <w:rFonts w:ascii="Helvetica Light" w:hAnsi="Helvetica Light" w:cs="Helvetica Light"/>
-          <w:sz w:val="24"/>
-          <w:sz-cs w:val="24"/>
-        </w:rPr>
-        <w:t xml:space="preserve">    Elastic-&gt;&gt;OpenClaw: Return structured update description</w:t>
+        <w:t xml:space="preserve">    Dev-&gt;&gt;AgentBuilder: Input GitLab repository list</w:t>
+      </w:r>
+    </w:p>
+    <w:p>
+      <w:pPr/>
+      <w:r>
+        <w:rPr>
+          <w:rFonts w:ascii="Helvetica Light" w:hAnsi="Helvetica Light" w:cs="Helvetica Light"/>
+          <w:sz w:val="24"/>
+          <w:sz-cs w:val="24"/>
+        </w:rPr>
+        <w:t xml:space="preserve">    AgentBuilder-&gt;&gt;Backend: Request repository registration/check</w:t>
+      </w:r>
+    </w:p>
+    <w:p>
+      <w:pPr/>
+      <w:r>
+        <w:rPr>
+          <w:rFonts w:ascii="Helvetica Light" w:hAnsi="Helvetica Light" w:cs="Helvetica Light"/>
+          <w:sz w:val="24"/>
+          <w:sz-cs w:val="24"/>
+        </w:rPr>
+        <w:t xml:space="preserve">    Backend-&gt;&gt;Secrets: Read MongoDB URI / GitLab token / Elastic key</w:t>
+      </w:r>
+    </w:p>
+    <w:p>
+      <w:pPr/>
+      <w:r>
+        <w:rPr>
+          <w:rFonts w:ascii="Helvetica Light" w:hAnsi="Helvetica Light" w:cs="Helvetica Light"/>
+          <w:sz w:val="24"/>
+          <w:sz-cs w:val="24"/>
+        </w:rPr>
+        <w:t xml:space="preserve">    Backend-&gt;&gt;Mongo: Save repository list by user account</w:t>
+      </w:r>
+    </w:p>
+    <w:p>
+      <w:pPr/>
+      <w:r>
+        <w:rPr>
+          <w:rFonts w:ascii="Helvetica Light" w:hAnsi="Helvetica Light" w:cs="Helvetica Light"/>
+          <w:sz w:val="24"/>
+          <w:sz-cs w:val="24"/>
+        </w:rPr>
+        <w:t xml:space="preserve">    Backend-&gt;&gt;Mongo: Get user's GitLab repository list</w:t>
+      </w:r>
+    </w:p>
+    <w:p>
+      <w:pPr/>
+      <w:r>
+        <w:rPr>
+          <w:rFonts w:ascii="Helvetica Light" w:hAnsi="Helvetica Light" w:cs="Helvetica Light"/>
+          <w:sz w:val="24"/>
+          <w:sz-cs w:val="24"/>
+        </w:rPr>
+        <w:t xml:space="preserve"/>
+      </w:r>
+    </w:p>
+    <w:p>
+      <w:pPr/>
+      <w:r>
+        <w:rPr>
+          <w:rFonts w:ascii="Helvetica Light" w:hAnsi="Helvetica Light" w:cs="Helvetica Light"/>
+          <w:sz w:val="24"/>
+          <w:sz-cs w:val="24"/>
+        </w:rPr>
+        <w:t xml:space="preserve">    Backend-&gt;&gt;Elastic: Query already-indexed native app policy updates</w:t>
+      </w:r>
+    </w:p>
+    <w:p>
+      <w:pPr/>
+      <w:r>
+        <w:rPr>
+          <w:rFonts w:ascii="Helvetica Light" w:hAnsi="Helvetica Light" w:cs="Helvetica Light"/>
+          <w:sz w:val="24"/>
+          <w:sz-cs w:val="24"/>
+        </w:rPr>
+        <w:t xml:space="preserve">    Elastic-&gt;&gt;Backend: Return structured update description</w:t>
       </w:r>
     </w:p>
     <w:p>
@@ -1055,7 +1198,7 @@
           <w:sz w:val="24"/>
           <w:sz-cs w:val="24"/>
         </w:rPr>
-        <w:t xml:space="preserve">        OpenClaw-&gt;&gt;Dev: No Merge Request needed</w:t>
+        <w:t xml:space="preserve">        AgentBuilder-&gt;&gt;Dev: No Merge Request needed</w:t>
       </w:r>
     </w:p>
     <w:p>
@@ -1077,18 +1220,18 @@
           <w:sz w:val="24"/>
           <w:sz-cs w:val="24"/>
         </w:rPr>
-        <w:t xml:space="preserve">        OpenClaw-&gt;&gt;Repo: Clone/fetch target repo into isolated workspace</w:t>
-      </w:r>
-    </w:p>
-    <w:p>
-      <w:pPr/>
-      <w:r>
-        <w:rPr>
-          <w:rFonts w:ascii="Helvetica Light" w:hAnsi="Helvetica Light" w:cs="Helvetica Light"/>
-          <w:sz w:val="24"/>
-          <w:sz-cs w:val="24"/>
-        </w:rPr>
-        <w:t xml:space="preserve">        OpenClaw-&gt;&gt;Agent: Send workspace path + Elastic context + repo facts</w:t>
+        <w:t xml:space="preserve">        Backend-&gt;&gt;Repo: Clone/fetch target repo into isolated workspace</w:t>
+      </w:r>
+    </w:p>
+    <w:p>
+      <w:pPr/>
+      <w:r>
+        <w:rPr>
+          <w:rFonts w:ascii="Helvetica Light" w:hAnsi="Helvetica Light" w:cs="Helvetica Light"/>
+          <w:sz w:val="24"/>
+          <w:sz-cs w:val="24"/>
+        </w:rPr>
+        <w:t xml:space="preserve">        Backend-&gt;&gt;Agent: Send workspace path + Elastic context + repo facts</w:t>
       </w:r>
     </w:p>
     <w:p>
@@ -1154,18 +1297,18 @@
           <w:sz w:val="24"/>
           <w:sz-cs w:val="24"/>
         </w:rPr>
-        <w:t xml:space="preserve">        OpenClaw-&gt;&gt;Repo: Create branch and commit generated diff</w:t>
-      </w:r>
-    </w:p>
-    <w:p>
-      <w:pPr/>
-      <w:r>
-        <w:rPr>
-          <w:rFonts w:ascii="Helvetica Light" w:hAnsi="Helvetica Light" w:cs="Helvetica Light"/>
-          <w:sz w:val="24"/>
-          <w:sz-cs w:val="24"/>
-        </w:rPr>
-        <w:t xml:space="preserve">        OpenClaw-&gt;&gt;MR: Create GitLab Merge Request</w:t>
+        <w:t xml:space="preserve">        Backend-&gt;&gt;Repo: Create branch and commit generated diff</w:t>
+      </w:r>
+    </w:p>
+    <w:p>
+      <w:pPr/>
+      <w:r>
+        <w:rPr>
+          <w:rFonts w:ascii="Helvetica Light" w:hAnsi="Helvetica Light" w:cs="Helvetica Light"/>
+          <w:sz w:val="24"/>
+          <w:sz-cs w:val="24"/>
+        </w:rPr>
+        <w:t xml:space="preserve">        Backend-&gt;&gt;MR: Create GitLab Merge Request</w:t>
       </w:r>
     </w:p>
     <w:p>
@@ -1253,7 +1396,29 @@
           <w:sz w:val="24"/>
           <w:sz-cs w:val="24"/>
         </w:rPr>
-        <w:t xml:space="preserve">Used for fast demo and simple user experience. The Flutter Developer sends repo list via Telegram. OpenClaw processes it immediately and does not persist repo list in MongoDB.</w:t>
+        <w:t xml:space="preserve">Used for fast demo and simple user experience. The Flutter Developer sends repo</w:t>
+      </w:r>
+    </w:p>
+    <w:p>
+      <w:pPr/>
+      <w:r>
+        <w:rPr>
+          <w:rFonts w:ascii="Helvetica Light" w:hAnsi="Helvetica Light" w:cs="Helvetica Light"/>
+          <w:sz w:val="24"/>
+          <w:sz-cs w:val="24"/>
+        </w:rPr>
+        <w:t xml:space="preserve">list via Telegram. Agent 1 processes it immediately and does not persist repo</w:t>
+      </w:r>
+    </w:p>
+    <w:p>
+      <w:pPr/>
+      <w:r>
+        <w:rPr>
+          <w:rFonts w:ascii="Helvetica Light" w:hAnsi="Helvetica Light" w:cs="Helvetica Light"/>
+          <w:sz w:val="24"/>
+          <w:sz-cs w:val="24"/>
+        </w:rPr>
+        <w:t xml:space="preserve">list in MongoDB.</w:t>
       </w:r>
     </w:p>
     <w:p>
@@ -1418,7 +1583,18 @@
           <w:sz w:val="24"/>
           <w:sz-cs w:val="24"/>
         </w:rPr>
-        <w:t xml:space="preserve">        participant OpenClaw as Agent 1: patchpilot-runtime</w:t>
+        <w:t xml:space="preserve">        participant AgentBuilder as Agent Builder: patchpilot-runtime</w:t>
+      </w:r>
+    </w:p>
+    <w:p>
+      <w:pPr/>
+      <w:r>
+        <w:rPr>
+          <w:rFonts w:ascii="Helvetica Light" w:hAnsi="Helvetica Light" w:cs="Helvetica Light"/>
+          <w:sz w:val="24"/>
+          <w:sz-cs w:val="24"/>
+        </w:rPr>
+        <w:t xml:space="preserve">        participant Backend as Cloud Run Tool Backend</w:t>
       </w:r>
     </w:p>
     <w:p>
@@ -1539,7 +1715,7 @@
           <w:sz w:val="24"/>
           <w:sz-cs w:val="24"/>
         </w:rPr>
-        <w:t xml:space="preserve">        participant Secrets as Env Secrets</w:t>
+        <w:t xml:space="preserve">        participant Secrets as Secret Manager</w:t>
       </w:r>
     </w:p>
     <w:p>
@@ -1594,51 +1770,62 @@
           <w:sz w:val="24"/>
           <w:sz-cs w:val="24"/>
         </w:rPr>
-        <w:t xml:space="preserve">    Telegram-&gt;&gt;OpenClaw: Forward repo list as runtime input</w:t>
-      </w:r>
-    </w:p>
-    <w:p>
-      <w:pPr/>
-      <w:r>
-        <w:rPr>
-          <w:rFonts w:ascii="Helvetica Light" w:hAnsi="Helvetica Light" w:cs="Helvetica Light"/>
-          <w:sz w:val="24"/>
-          <w:sz-cs w:val="24"/>
-        </w:rPr>
-        <w:t xml:space="preserve">    OpenClaw-&gt;&gt;Secrets: Read Elastic / GitLab / Telegram secrets</w:t>
-      </w:r>
-    </w:p>
-    <w:p>
-      <w:pPr/>
-      <w:r>
-        <w:rPr>
-          <w:rFonts w:ascii="Helvetica Light" w:hAnsi="Helvetica Light" w:cs="Helvetica Light"/>
-          <w:sz w:val="24"/>
-          <w:sz-cs w:val="24"/>
-        </w:rPr>
-        <w:t xml:space="preserve"/>
-      </w:r>
-    </w:p>
-    <w:p>
-      <w:pPr/>
-      <w:r>
-        <w:rPr>
-          <w:rFonts w:ascii="Helvetica Light" w:hAnsi="Helvetica Light" w:cs="Helvetica Light"/>
-          <w:sz w:val="24"/>
-          <w:sz-cs w:val="24"/>
-        </w:rPr>
-        <w:t xml:space="preserve">    OpenClaw-&gt;&gt;Elastic: Query already-indexed native app policy updates</w:t>
-      </w:r>
-    </w:p>
-    <w:p>
-      <w:pPr/>
-      <w:r>
-        <w:rPr>
-          <w:rFonts w:ascii="Helvetica Light" w:hAnsi="Helvetica Light" w:cs="Helvetica Light"/>
-          <w:sz w:val="24"/>
-          <w:sz-cs w:val="24"/>
-        </w:rPr>
-        <w:t xml:space="preserve">    Elastic-&gt;&gt;OpenClaw: Return structured update description</w:t>
+        <w:t xml:space="preserve">    Telegram-&gt;&gt;Backend: Forward repo list as runtime input</w:t>
+      </w:r>
+    </w:p>
+    <w:p>
+      <w:pPr/>
+      <w:r>
+        <w:rPr>
+          <w:rFonts w:ascii="Helvetica Light" w:hAnsi="Helvetica Light" w:cs="Helvetica Light"/>
+          <w:sz w:val="24"/>
+          <w:sz-cs w:val="24"/>
+        </w:rPr>
+        <w:t xml:space="preserve">    Backend-&gt;&gt;AgentBuilder: Invoke Agent 1 with repo list</w:t>
+      </w:r>
+    </w:p>
+    <w:p>
+      <w:pPr/>
+      <w:r>
+        <w:rPr>
+          <w:rFonts w:ascii="Helvetica Light" w:hAnsi="Helvetica Light" w:cs="Helvetica Light"/>
+          <w:sz w:val="24"/>
+          <w:sz-cs w:val="24"/>
+        </w:rPr>
+        <w:t xml:space="preserve">    Backend-&gt;&gt;Secrets: Read Elastic / GitLab / Telegram secrets</w:t>
+      </w:r>
+    </w:p>
+    <w:p>
+      <w:pPr/>
+      <w:r>
+        <w:rPr>
+          <w:rFonts w:ascii="Helvetica Light" w:hAnsi="Helvetica Light" w:cs="Helvetica Light"/>
+          <w:sz w:val="24"/>
+          <w:sz-cs w:val="24"/>
+        </w:rPr>
+        <w:t xml:space="preserve"/>
+      </w:r>
+    </w:p>
+    <w:p>
+      <w:pPr/>
+      <w:r>
+        <w:rPr>
+          <w:rFonts w:ascii="Helvetica Light" w:hAnsi="Helvetica Light" w:cs="Helvetica Light"/>
+          <w:sz w:val="24"/>
+          <w:sz-cs w:val="24"/>
+        </w:rPr>
+        <w:t xml:space="preserve">    Backend-&gt;&gt;Elastic: Query already-indexed native app policy updates</w:t>
+      </w:r>
+    </w:p>
+    <w:p>
+      <w:pPr/>
+      <w:r>
+        <w:rPr>
+          <w:rFonts w:ascii="Helvetica Light" w:hAnsi="Helvetica Light" w:cs="Helvetica Light"/>
+          <w:sz w:val="24"/>
+          <w:sz-cs w:val="24"/>
+        </w:rPr>
+        <w:t xml:space="preserve">    Elastic-&gt;&gt;Backend: Return structured update description</w:t>
       </w:r>
     </w:p>
     <w:p>
@@ -1671,7 +1858,7 @@
           <w:sz w:val="24"/>
           <w:sz-cs w:val="24"/>
         </w:rPr>
-        <w:t xml:space="preserve">        OpenClaw-&gt;&gt;Telegram: Send "No Merge Request needed"</w:t>
+        <w:t xml:space="preserve">        Backend-&gt;&gt;Telegram: Send "No Merge Request needed"</w:t>
       </w:r>
     </w:p>
     <w:p>
@@ -1704,18 +1891,18 @@
           <w:sz w:val="24"/>
           <w:sz-cs w:val="24"/>
         </w:rPr>
-        <w:t xml:space="preserve">        OpenClaw-&gt;&gt;Repo: Clone/fetch target repo into isolated workspace</w:t>
-      </w:r>
-    </w:p>
-    <w:p>
-      <w:pPr/>
-      <w:r>
-        <w:rPr>
-          <w:rFonts w:ascii="Helvetica Light" w:hAnsi="Helvetica Light" w:cs="Helvetica Light"/>
-          <w:sz w:val="24"/>
-          <w:sz-cs w:val="24"/>
-        </w:rPr>
-        <w:t xml:space="preserve">        OpenClaw-&gt;&gt;Agent: Send workspace path + Elastic context + repo facts</w:t>
+        <w:t xml:space="preserve">        Backend-&gt;&gt;Repo: Clone/fetch target repo into isolated workspace</w:t>
+      </w:r>
+    </w:p>
+    <w:p>
+      <w:pPr/>
+      <w:r>
+        <w:rPr>
+          <w:rFonts w:ascii="Helvetica Light" w:hAnsi="Helvetica Light" w:cs="Helvetica Light"/>
+          <w:sz w:val="24"/>
+          <w:sz-cs w:val="24"/>
+        </w:rPr>
+        <w:t xml:space="preserve">        Backend-&gt;&gt;Agent: Send workspace path + Elastic context + repo facts</w:t>
       </w:r>
     </w:p>
     <w:p>
@@ -1781,29 +1968,29 @@
           <w:sz w:val="24"/>
           <w:sz-cs w:val="24"/>
         </w:rPr>
-        <w:t xml:space="preserve">        OpenClaw-&gt;&gt;Repo: Create branch and commit generated diff</w:t>
-      </w:r>
-    </w:p>
-    <w:p>
-      <w:pPr/>
-      <w:r>
-        <w:rPr>
-          <w:rFonts w:ascii="Helvetica Light" w:hAnsi="Helvetica Light" w:cs="Helvetica Light"/>
-          <w:sz w:val="24"/>
-          <w:sz-cs w:val="24"/>
-        </w:rPr>
-        <w:t xml:space="preserve">        OpenClaw-&gt;&gt;MR: Create GitLab Merge Request</w:t>
-      </w:r>
-    </w:p>
-    <w:p>
-      <w:pPr/>
-      <w:r>
-        <w:rPr>
-          <w:rFonts w:ascii="Helvetica Light" w:hAnsi="Helvetica Light" w:cs="Helvetica Light"/>
-          <w:sz w:val="24"/>
-          <w:sz-cs w:val="24"/>
-        </w:rPr>
-        <w:t xml:space="preserve">        OpenClaw-&gt;&gt;Telegram: Send MR link to developer</w:t>
+        <w:t xml:space="preserve">        Backend-&gt;&gt;Repo: Create branch and commit generated diff</w:t>
+      </w:r>
+    </w:p>
+    <w:p>
+      <w:pPr/>
+      <w:r>
+        <w:rPr>
+          <w:rFonts w:ascii="Helvetica Light" w:hAnsi="Helvetica Light" w:cs="Helvetica Light"/>
+          <w:sz w:val="24"/>
+          <w:sz-cs w:val="24"/>
+        </w:rPr>
+        <w:t xml:space="preserve">        Backend-&gt;&gt;MR: Create GitLab Merge Request</w:t>
+      </w:r>
+    </w:p>
+    <w:p>
+      <w:pPr/>
+      <w:r>
+        <w:rPr>
+          <w:rFonts w:ascii="Helvetica Light" w:hAnsi="Helvetica Light" w:cs="Helvetica Light"/>
+          <w:sz w:val="24"/>
+          <w:sz-cs w:val="24"/>
+        </w:rPr>
+        <w:t xml:space="preserve">        Backend-&gt;&gt;Telegram: Send MR link to developer</w:t>
       </w:r>
     </w:p>
     <w:p>
@@ -1946,7 +2133,7 @@
           <w:sz w:val="24"/>
           <w:sz-cs w:val="24"/>
         </w:rPr>
-        <w:t xml:space="preserve">3. Agent 1 asks Elastic for relevant native platform updates from the already-indexed policy context.</w:t>
+        <w:t xml:space="preserve">3. Agent 1 calls the Cloud Run tool backend, which asks Elastic for relevant native platform updates from the already-indexed policy context.</w:t>
       </w:r>
     </w:p>
     <w:p>
@@ -1979,7 +2166,7 @@
           <w:sz w:val="24"/>
           <w:sz-cs w:val="24"/>
         </w:rPr>
-        <w:t xml:space="preserve">6. If an update is relevant, Agent 1 clones the repo and sends workspace path, Elastic context, and repo facts to Antigravity CLI Coding Worker.</w:t>
+        <w:t xml:space="preserve">6. If an update is relevant, the Cloud Run backend clones the repo and sends workspace path, Elastic context, and repo facts to Antigravity CLI Coding Worker.</w:t>
       </w:r>
     </w:p>
     <w:p>
@@ -2067,29 +2254,29 @@
           <w:sz w:val="24"/>
           <w:sz-cs w:val="24"/>
         </w:rPr>
-        <w:t xml:space="preserve">1. Developer inputs repo list in OpenClaw / platform UI.</w:t>
-      </w:r>
-    </w:p>
-    <w:p>
-      <w:pPr/>
-      <w:r>
-        <w:rPr>
-          <w:rFonts w:ascii="Helvetica Light" w:hAnsi="Helvetica Light" w:cs="Helvetica Light"/>
-          <w:sz w:val="24"/>
-          <w:sz-cs w:val="24"/>
-        </w:rPr>
-        <w:t xml:space="preserve">2. OpenClaw saves repo list by user account to MongoDB.</w:t>
-      </w:r>
-    </w:p>
-    <w:p>
-      <w:pPr/>
-      <w:r>
-        <w:rPr>
-          <w:rFonts w:ascii="Helvetica Light" w:hAnsi="Helvetica Light" w:cs="Helvetica Light"/>
-          <w:sz w:val="24"/>
-          <w:sz-cs w:val="24"/>
-        </w:rPr>
-        <w:t xml:space="preserve">3. OpenClaw loads repos by user account when check starts.</w:t>
+        <w:t xml:space="preserve">1. Developer inputs repo list in the Agent Builder / platform UI.</w:t>
+      </w:r>
+    </w:p>
+    <w:p>
+      <w:pPr/>
+      <w:r>
+        <w:rPr>
+          <w:rFonts w:ascii="Helvetica Light" w:hAnsi="Helvetica Light" w:cs="Helvetica Light"/>
+          <w:sz w:val="24"/>
+          <w:sz-cs w:val="24"/>
+        </w:rPr>
+        <w:t xml:space="preserve">2. Cloud Run backend saves repo list by user account to MongoDB.</w:t>
+      </w:r>
+    </w:p>
+    <w:p>
+      <w:pPr/>
+      <w:r>
+        <w:rPr>
+          <w:rFonts w:ascii="Helvetica Light" w:hAnsi="Helvetica Light" w:cs="Helvetica Light"/>
+          <w:sz w:val="24"/>
+          <w:sz-cs w:val="24"/>
+        </w:rPr>
+        <w:t xml:space="preserve">3. Cloud Run backend loads repos by user account when check starts.</w:t>
       </w:r>
     </w:p>
     <w:p>
@@ -2353,7 +2540,7 @@
           <w:sz w:val="24"/>
           <w:sz-cs w:val="24"/>
         </w:rPr>
-        <w:t xml:space="preserve">- As a hackathon judge, I can see Elastic used as the policy context layer and Antigravity used as the coding agent.</w:t>
+        <w:t xml:space="preserve">- As a hackathon judge, I can see Google Cloud Agent Builder, Cloud Run, Secret Manager, Elastic, GitLab, and Antigravity used together in the agent flow.</w:t>
       </w:r>
     </w:p>
     <w:p>
@@ -2661,6 +2848,17 @@
           <w:sz w:val="24"/>
           <w:sz-cs w:val="24"/>
         </w:rPr>
+        <w:t xml:space="preserve">- Prefer Secret Manager for production/demo secrets on Google Cloud.</w:t>
+      </w:r>
+    </w:p>
+    <w:p>
+      <w:pPr/>
+      <w:r>
+        <w:rPr>
+          <w:rFonts w:ascii="Helvetica Light" w:hAnsi="Helvetica Light" w:cs="Helvetica Light"/>
+          <w:sz w:val="24"/>
+          <w:sz-cs w:val="24"/>
+        </w:rPr>
         <w:t xml:space="preserve">- Store Antigravity authentication/configuration as runtime secrets or user-scoped CLI config.</w:t>
       </w:r>
     </w:p>
@@ -3024,51 +3222,62 @@
           <w:sz w:val="24"/>
           <w:sz-cs w:val="24"/>
         </w:rPr>
-        <w:t xml:space="preserve">- OpenClaw Tools: https://docs.openclaw.ai/tools</w:t>
-      </w:r>
-    </w:p>
-    <w:p>
-      <w:pPr/>
-      <w:r>
-        <w:rPr>
-          <w:rFonts w:ascii="Helvetica Light" w:hAnsi="Helvetica Light" w:cs="Helvetica Light"/>
-          <w:sz w:val="24"/>
-          <w:sz-cs w:val="24"/>
-        </w:rPr>
-        <w:t xml:space="preserve">- OpenClaw Skills: https://docs.openclaw.ai/tools/skills</w:t>
-      </w:r>
-    </w:p>
-    <w:p>
-      <w:pPr/>
-      <w:r>
-        <w:rPr>
-          <w:rFonts w:ascii="Helvetica Light" w:hAnsi="Helvetica Light" w:cs="Helvetica Light"/>
-          <w:sz w:val="24"/>
-          <w:sz-cs w:val="24"/>
-        </w:rPr>
-        <w:t xml:space="preserve">- OpenClaw Telegram channel: https://docs.openclaw.ai/channels/telegram</w:t>
-      </w:r>
-    </w:p>
-    <w:p>
-      <w:pPr/>
-      <w:r>
-        <w:rPr>
-          <w:rFonts w:ascii="Helvetica Light" w:hAnsi="Helvetica Light" w:cs="Helvetica Light"/>
-          <w:sz w:val="24"/>
-          <w:sz-cs w:val="24"/>
-        </w:rPr>
-        <w:t xml:space="preserve">- OpenClaw channels overview: https://docs.openclaw.ai/channels</w:t>
-      </w:r>
-    </w:p>
-    <w:p>
-      <w:pPr/>
-      <w:r>
-        <w:rPr>
-          <w:rFonts w:ascii="Helvetica Light" w:hAnsi="Helvetica Light" w:cs="Helvetica Light"/>
-          <w:sz w:val="24"/>
-          <w:sz-cs w:val="24"/>
-        </w:rPr>
-        <w:t xml:space="preserve">- OpenClaw plugin bundles: https://docs.openclaw.ai/plugins/bundles</w:t>
+        <w:t xml:space="preserve">- Google Cloud Rapid Agent Hackathon resources: https://rapid-agent.devpost.com/resources</w:t>
+      </w:r>
+    </w:p>
+    <w:p>
+      <w:pPr/>
+      <w:r>
+        <w:rPr>
+          <w:rFonts w:ascii="Helvetica Light" w:hAnsi="Helvetica Light" w:cs="Helvetica Light"/>
+          <w:sz w:val="24"/>
+          <w:sz-cs w:val="24"/>
+        </w:rPr>
+        <w:t xml:space="preserve">- Gemini Enterprise Agent Platform: https://cloud.google.com/products/gemini-enterprise-agent-platform</w:t>
+      </w:r>
+    </w:p>
+    <w:p>
+      <w:pPr/>
+      <w:r>
+        <w:rPr>
+          <w:rFonts w:ascii="Helvetica Light" w:hAnsi="Helvetica Light" w:cs="Helvetica Light"/>
+          <w:sz w:val="24"/>
+          <w:sz-cs w:val="24"/>
+        </w:rPr>
+        <w:t xml:space="preserve">- Gemini Enterprise agents overview: https://docs.cloud.google.com/gemini/enterprise/docs/agents-overview</w:t>
+      </w:r>
+    </w:p>
+    <w:p>
+      <w:pPr/>
+      <w:r>
+        <w:rPr>
+          <w:rFonts w:ascii="Helvetica Light" w:hAnsi="Helvetica Light" w:cs="Helvetica Light"/>
+          <w:sz w:val="24"/>
+          <w:sz-cs w:val="24"/>
+        </w:rPr>
+        <w:t xml:space="preserve">- Agent Platform Runtime / Scale agents: https://docs.cloud.google.com/gemini-enterprise-agent-platform/scale</w:t>
+      </w:r>
+    </w:p>
+    <w:p>
+      <w:pPr/>
+      <w:r>
+        <w:rPr>
+          <w:rFonts w:ascii="Helvetica Light" w:hAnsi="Helvetica Light" w:cs="Helvetica Light"/>
+          <w:sz w:val="24"/>
+          <w:sz-cs w:val="24"/>
+        </w:rPr>
+        <w:t xml:space="preserve">- Cloud Run: https://cloud.google.com/run</w:t>
+      </w:r>
+    </w:p>
+    <w:p>
+      <w:pPr/>
+      <w:r>
+        <w:rPr>
+          <w:rFonts w:ascii="Helvetica Light" w:hAnsi="Helvetica Light" w:cs="Helvetica Light"/>
+          <w:sz w:val="24"/>
+          <w:sz-cs w:val="24"/>
+        </w:rPr>
+        <w:t xml:space="preserve">- Secret Manager: https://cloud.google.com/security/products/secret-manager</w:t>
       </w:r>
     </w:p>
     <w:p>

</xml_diff>